<commit_message>
Auto update on 15-10-2025 at 22:00:32.00
</commit_message>
<xml_diff>
--- a/Experiments/OOPS_list.docx
+++ b/Experiments/OOPS_list.docx
@@ -390,8 +390,17 @@
           <w:rFonts w:ascii="Times New Roman" w:hAnsi="Times New Roman" w:cs="Times New Roman"/>
           <w:sz w:val="28"/>
           <w:szCs w:val="28"/>
-        </w:rPr>
-        <w:t xml:space="preserve">3. Implement CPP to demonstrate Exception Handling for Gmail Account Login OR ATM Pin Verification. </w:t>
+          <w:highlight w:val="yellow"/>
+        </w:rPr>
+        <w:t>3. Implement CPP to demonstrate Exception Handling for Gmail Account Login OR ATM Pin Verification.</w:t>
+      </w:r>
+      <w:r>
+        <w:rPr>
+          <w:rFonts w:ascii="Times New Roman" w:hAnsi="Times New Roman" w:cs="Times New Roman"/>
+          <w:sz w:val="28"/>
+          <w:szCs w:val="28"/>
+        </w:rPr>
+        <w:t xml:space="preserve"> </w:t>
       </w:r>
     </w:p>
     <w:p>
@@ -518,7 +527,24 @@
           <w:szCs w:val="28"/>
         </w:rPr>
         <w:lastRenderedPageBreak/>
-        <w:t xml:space="preserve"> 6. Implement a function template that finds the maximum of two values of any data type (e.g., integers, floats, strings). Create a class template Stack that implements a basic stack data structure. The class should support push, pop, as well as checking if the stack is empty. </w:t>
+        <w:t xml:space="preserve"> </w:t>
+      </w:r>
+      <w:r>
+        <w:rPr>
+          <w:rFonts w:ascii="Times New Roman" w:hAnsi="Times New Roman" w:cs="Times New Roman"/>
+          <w:sz w:val="28"/>
+          <w:szCs w:val="28"/>
+          <w:highlight w:val="yellow"/>
+        </w:rPr>
+        <w:t>6. Implement a function template that finds the maximum of two values of any data type (e.g., integers, floats, strings). Create a class template Stack that implements a basic stack data structure. The class should support push, pop, as well as checking if the stack is empty.</w:t>
+      </w:r>
+      <w:r>
+        <w:rPr>
+          <w:rFonts w:ascii="Times New Roman" w:hAnsi="Times New Roman" w:cs="Times New Roman"/>
+          <w:sz w:val="28"/>
+          <w:szCs w:val="28"/>
+        </w:rPr>
+        <w:t xml:space="preserve"> </w:t>
       </w:r>
     </w:p>
     <w:p>
@@ -556,13 +582,15 @@
           <w:rFonts w:ascii="Times New Roman" w:hAnsi="Times New Roman" w:cs="Times New Roman"/>
           <w:sz w:val="28"/>
           <w:szCs w:val="28"/>
-        </w:rPr>
-      </w:pPr>
-      <w:r>
-        <w:rPr>
-          <w:rFonts w:ascii="Times New Roman" w:hAnsi="Times New Roman" w:cs="Times New Roman"/>
-          <w:sz w:val="28"/>
-          <w:szCs w:val="28"/>
+          <w:highlight w:val="yellow"/>
+        </w:rPr>
+      </w:pPr>
+      <w:r>
+        <w:rPr>
+          <w:rFonts w:ascii="Times New Roman" w:hAnsi="Times New Roman" w:cs="Times New Roman"/>
+          <w:sz w:val="28"/>
+          <w:szCs w:val="28"/>
+          <w:highlight w:val="yellow"/>
         </w:rPr>
         <w:t xml:space="preserve">1. Implement following functionality using file handling. </w:t>
       </w:r>
@@ -574,13 +602,15 @@
           <w:rFonts w:ascii="Times New Roman" w:hAnsi="Times New Roman" w:cs="Times New Roman"/>
           <w:sz w:val="28"/>
           <w:szCs w:val="28"/>
-        </w:rPr>
-      </w:pPr>
-      <w:r>
-        <w:rPr>
-          <w:rFonts w:ascii="Times New Roman" w:hAnsi="Times New Roman" w:cs="Times New Roman"/>
-          <w:sz w:val="28"/>
-          <w:szCs w:val="28"/>
+          <w:highlight w:val="yellow"/>
+        </w:rPr>
+      </w:pPr>
+      <w:r>
+        <w:rPr>
+          <w:rFonts w:ascii="Times New Roman" w:hAnsi="Times New Roman" w:cs="Times New Roman"/>
+          <w:sz w:val="28"/>
+          <w:szCs w:val="28"/>
+          <w:highlight w:val="yellow"/>
         </w:rPr>
         <w:t>a. Create and write student object.</w:t>
       </w:r>
@@ -592,13 +622,15 @@
           <w:rFonts w:ascii="Times New Roman" w:hAnsi="Times New Roman" w:cs="Times New Roman"/>
           <w:sz w:val="28"/>
           <w:szCs w:val="28"/>
-        </w:rPr>
-      </w:pPr>
-      <w:r>
-        <w:rPr>
-          <w:rFonts w:ascii="Times New Roman" w:hAnsi="Times New Roman" w:cs="Times New Roman"/>
-          <w:sz w:val="28"/>
-          <w:szCs w:val="28"/>
+          <w:highlight w:val="yellow"/>
+        </w:rPr>
+      </w:pPr>
+      <w:r>
+        <w:rPr>
+          <w:rFonts w:ascii="Times New Roman" w:hAnsi="Times New Roman" w:cs="Times New Roman"/>
+          <w:sz w:val="28"/>
+          <w:szCs w:val="28"/>
+          <w:highlight w:val="yellow"/>
         </w:rPr>
         <w:t xml:space="preserve"> b. Display student details.</w:t>
       </w:r>
@@ -610,13 +642,15 @@
           <w:rFonts w:ascii="Times New Roman" w:hAnsi="Times New Roman" w:cs="Times New Roman"/>
           <w:sz w:val="28"/>
           <w:szCs w:val="28"/>
-        </w:rPr>
-      </w:pPr>
-      <w:r>
-        <w:rPr>
-          <w:rFonts w:ascii="Times New Roman" w:hAnsi="Times New Roman" w:cs="Times New Roman"/>
-          <w:sz w:val="28"/>
-          <w:szCs w:val="28"/>
+          <w:highlight w:val="yellow"/>
+        </w:rPr>
+      </w:pPr>
+      <w:r>
+        <w:rPr>
+          <w:rFonts w:ascii="Times New Roman" w:hAnsi="Times New Roman" w:cs="Times New Roman"/>
+          <w:sz w:val="28"/>
+          <w:szCs w:val="28"/>
+          <w:highlight w:val="yellow"/>
         </w:rPr>
         <w:t xml:space="preserve"> c. Search a record based on Roll no. and name </w:t>
       </w:r>
@@ -635,42 +669,61 @@
           <w:rFonts w:ascii="Times New Roman" w:hAnsi="Times New Roman" w:cs="Times New Roman"/>
           <w:sz w:val="28"/>
           <w:szCs w:val="28"/>
-        </w:rPr>
-        <w:t xml:space="preserve">d. Modify a student record e. Delete student record </w:t>
-      </w:r>
-    </w:p>
-    <w:p>
-      <w:pPr>
-        <w:spacing w:line="204" w:lineRule="auto"/>
-        <w:rPr>
-          <w:rFonts w:ascii="Times New Roman" w:hAnsi="Times New Roman" w:cs="Times New Roman"/>
-          <w:sz w:val="28"/>
-          <w:szCs w:val="28"/>
-        </w:rPr>
-      </w:pPr>
-      <w:r>
-        <w:rPr>
-          <w:rFonts w:ascii="Times New Roman" w:hAnsi="Times New Roman" w:cs="Times New Roman"/>
-          <w:sz w:val="28"/>
-          <w:szCs w:val="28"/>
-        </w:rPr>
-        <w:t xml:space="preserve">2. Write a C++ program to generate Country-Currency chart of all countries across the globe using MAP Container </w:t>
-      </w:r>
-    </w:p>
-    <w:p>
-      <w:pPr>
-        <w:spacing w:line="204" w:lineRule="auto"/>
-        <w:rPr>
-          <w:rFonts w:ascii="Times New Roman" w:hAnsi="Times New Roman" w:cs="Times New Roman"/>
-          <w:sz w:val="28"/>
-          <w:szCs w:val="28"/>
-        </w:rPr>
-      </w:pPr>
-      <w:r>
-        <w:rPr>
-          <w:rFonts w:ascii="Times New Roman" w:hAnsi="Times New Roman" w:cs="Times New Roman"/>
-          <w:sz w:val="28"/>
-          <w:szCs w:val="28"/>
+          <w:highlight w:val="yellow"/>
+        </w:rPr>
+        <w:t>d. Modify a student record e. Delete student record</w:t>
+      </w:r>
+      <w:r>
+        <w:rPr>
+          <w:rFonts w:ascii="Times New Roman" w:hAnsi="Times New Roman" w:cs="Times New Roman"/>
+          <w:sz w:val="28"/>
+          <w:szCs w:val="28"/>
+        </w:rPr>
+        <w:t xml:space="preserve"> </w:t>
+      </w:r>
+    </w:p>
+    <w:p>
+      <w:pPr>
+        <w:spacing w:line="204" w:lineRule="auto"/>
+        <w:rPr>
+          <w:rFonts w:ascii="Times New Roman" w:hAnsi="Times New Roman" w:cs="Times New Roman"/>
+          <w:sz w:val="28"/>
+          <w:szCs w:val="28"/>
+        </w:rPr>
+      </w:pPr>
+      <w:r>
+        <w:rPr>
+          <w:rFonts w:ascii="Times New Roman" w:hAnsi="Times New Roman" w:cs="Times New Roman"/>
+          <w:sz w:val="28"/>
+          <w:szCs w:val="28"/>
+          <w:highlight w:val="yellow"/>
+        </w:rPr>
+        <w:t>2. Write a C++ program to generate Country-Currency chart of all countries across the globe using MAP Container</w:t>
+      </w:r>
+      <w:r>
+        <w:rPr>
+          <w:rFonts w:ascii="Times New Roman" w:hAnsi="Times New Roman" w:cs="Times New Roman"/>
+          <w:sz w:val="28"/>
+          <w:szCs w:val="28"/>
+        </w:rPr>
+        <w:t xml:space="preserve"> </w:t>
+      </w:r>
+    </w:p>
+    <w:p>
+      <w:pPr>
+        <w:spacing w:line="204" w:lineRule="auto"/>
+        <w:rPr>
+          <w:rFonts w:ascii="Times New Roman" w:hAnsi="Times New Roman" w:cs="Times New Roman"/>
+          <w:sz w:val="28"/>
+          <w:szCs w:val="28"/>
+        </w:rPr>
+      </w:pPr>
+      <w:r>
+        <w:rPr>
+          <w:rFonts w:ascii="Times New Roman" w:hAnsi="Times New Roman" w:cs="Times New Roman"/>
+          <w:sz w:val="28"/>
+          <w:szCs w:val="28"/>
+          <w:highlight w:val="yellow"/>
         </w:rPr>
         <w:t>3. Write a C++ program using Vector -Create a vector of integers, Add at least 5 elements to the vector, Display the contents of the vector, Access and print the 3rd element using both index and at() method. Remove the last element from the vector and print the updated vector.</w:t>
       </w:r>

</xml_diff>